<commit_message>
Correct V4.5 evolution graph audit
</commit_message>
<xml_diff>
--- a/Darwin's farm/游戏策划案v4.5.docx
+++ b/Darwin's farm/游戏策划案v4.5.docx
@@ -14484,7 +14484,7 @@
           <w:rFonts w:ascii="Cambria Math" w:hAnsi="Cambria Math" w:eastAsia="Cambria Math"/>
           <w:sz w:val="22"/>
         </w:rPr>
-        <w:t>式 19　wᵢ = NᵢAᵢFᵢ[1 + g(mᵢ − 20)] / [1 + c·max(0, pressureᵢ/R − 1)]</w:t>
+        <w:t>式 19　wᵢ = NᵢAᵢFᵢ[1 + g(mᵢ − 20)] / [1 + c·max(0, pressureᵢ/max(1,R) − 1)]</w:t>
       </w:r>
     </w:p>
     <w:p>
@@ -14710,7 +14710,7 @@
     <w:p>
       <w:pPr/>
       <w:r>
-        <w:t>进化网直接连接可双向读取；当前五个模板均为陆地。鸡只直接连接鹿，不能直接变狸猫；鹿可连接狸猫与猛鹿，狸猫可连接雀狮。来源五项性状须分别在目标模板 ±5 内，目标物种在同格尚不存在；候选模板须通过当日食物满足率 0.9、持续补给满足率 0.8。捕食目标还需猎物补充覆盖其需求 0.8。普通转化抽取来源 10%、至少 10、最多 100；本地分化成对时整支转化，保留另一支。</w:t>
+        <w:t>进化网直接连接可双向读取；当前五个模板均为陆地，白盒场景会注册全部五种。鸡连接鹿与狸猫；鹿连接鸡、狸猫、猛鹿；狸猫连接鸡、鹿、猛鹿、雀狮；猛鹿连接鹿、狸猫、雀狮；雀狮连接狸猫、猛鹿。连接只给候选资格，不保证转化，五项性状与食物门槛仍须通过。来源五项性状须分别在目标模板 ±5 内，目标物种在同格尚不存在；候选模板须通过当日食物满足率 0.9、持续补给满足率 0.8。捕食目标还需猎物补充覆盖其需求 0.8。普通转化抽取来源 10%、至少 10、最多 100；本地分化成对时整支转化，保留另一支。</w:t>
       </w:r>
     </w:p>
     <w:p>
@@ -19414,7 +19414,7 @@
                 <w:rFonts w:ascii="宋体" w:hAnsi="宋体"/>
                 <w:sz w:val="17"/>
               </w:rPr>
-              <w:t>来源鹿五项接近相连目标，现场有足量合法猎物和持续补充。狸猫可吃鸡或鹿，猛鹿只吃鸡；鸡不能直接转狸猫。</w:t>
+              <w:t>来源鹿五项接近相连目标，现场有足量合法猎物和持续补充。狸猫可吃鸡或鹿，猛鹿只吃鸡；鸡也能沿双向连接直接转狸猫，但须保留足量同格鸡供捕食。</w:t>
             </w:r>
           </w:p>
         </w:tc>
@@ -19447,7 +19447,7 @@
                 <w:rFonts w:ascii="宋体" w:hAnsi="宋体"/>
                 <w:sz w:val="17"/>
               </w:rPr>
-              <w:t>狸猫→雀狮</w:t>
+              <w:t>鸡→狸猫直连</w:t>
             </w:r>
           </w:p>
         </w:tc>
@@ -19462,7 +19462,7 @@
                 <w:rFonts w:ascii="宋体" w:hAnsi="宋体"/>
                 <w:sz w:val="17"/>
               </w:rPr>
-              <w:t>狸猫五项接近雀狮，鸡、鹿或其他合法猎物足够，目标应通过当日与持续供养门槛。</w:t>
+              <w:t>鸡即使尚未变鹿，只要当前性状接近狸猫模板，转化后仍有足量同格鸡及历史补充，也可走双向连接成为狸猫。</w:t>
             </w:r>
           </w:p>
         </w:tc>
@@ -19477,7 +19477,7 @@
                 <w:rFonts w:ascii="宋体" w:hAnsi="宋体"/>
                 <w:sz w:val="17"/>
               </w:rPr>
-              <w:t>模板完全匹配、鸡 3,000 且历史日净新增 100 时可取得雀狮资格；长期捕食和 15 分钟链待测。</w:t>
+              <w:t>逆向连接局部正例：鸡 3,000、目标 100 只狸猫，保留 2,900 只鸡且最近 10 日净新增各 100 时，目标资格通过。是否符合预期进化路线需策划确认。</w:t>
             </w:r>
           </w:p>
         </w:tc>
@@ -19495,7 +19495,7 @@
                 <w:rFonts w:ascii="宋体" w:hAnsi="宋体"/>
                 <w:sz w:val="17"/>
               </w:rPr>
-              <w:t>两群同属性鸡竞争</w:t>
+              <w:t>狸猫→雀狮</w:t>
             </w:r>
           </w:p>
         </w:tc>
@@ -19511,7 +19511,7 @@
                 <w:rFonts w:ascii="宋体" w:hAnsi="宋体"/>
                 <w:sz w:val="17"/>
               </w:rPr>
-              <w:t>共享一份植物，初始相同者不应因遍历顺序而形成悬殊平台。</w:t>
+              <w:t>狸猫五项接近雀狮，鸡、鹿或其他合法猎物足够，目标应通过当日与持续供养门槛。</w:t>
             </w:r>
           </w:p>
         </w:tc>
@@ -19527,7 +19527,7 @@
                 <w:rFonts w:ascii="宋体" w:hAnsi="宋体"/>
                 <w:sz w:val="17"/>
               </w:rPr>
-              <w:t>N=500+500、R=10,000、S=1,000,000、温湿匹配、关闭变异，200 日后为 595+595；库存 990,307。</w:t>
+              <w:t>模板完全匹配、鸡 3,000 且历史日净新增 100 时可取得雀狮资格；长期捕食和 15 分钟链待测。</w:t>
             </w:r>
           </w:p>
         </w:tc>
@@ -19544,7 +19544,7 @@
                 <w:rFonts w:ascii="宋体" w:hAnsi="宋体"/>
                 <w:sz w:val="17"/>
               </w:rPr>
-              <w:t>鸡鹿共同吃草</w:t>
+              <w:t>两群同属性鸡竞争</w:t>
             </w:r>
           </w:p>
         </w:tc>
@@ -19559,7 +19559,7 @@
                 <w:rFonts w:ascii="宋体" w:hAnsi="宋体"/>
                 <w:sz w:val="17"/>
               </w:rPr>
-              <w:t>鹿单只成本高、繁殖低，数量平台应低于鸡；两群资源不复制。</w:t>
+              <w:t>共享一份植物，初始相同者不应因遍历顺序而形成悬殊平台。</w:t>
             </w:r>
           </w:p>
         </w:tc>
@@ -19574,7 +19574,7 @@
                 <w:rFonts w:ascii="宋体" w:hAnsi="宋体"/>
                 <w:sz w:val="17"/>
               </w:rPr>
-              <w:t>鸡 5,000、鹿 200、R=100,000，200 日后鸡 10,016、鹿 205；R=10,000 时鸡 455、鹿 80，库存约 61,601。</w:t>
+              <w:t>N=500+500、R=10,000、S=1,000,000、温湿匹配、关闭变异，200 日后为 595+595；库存 990,307。</w:t>
             </w:r>
           </w:p>
         </w:tc>
@@ -19592,6 +19592,55 @@
                 <w:rFonts w:ascii="宋体" w:hAnsi="宋体"/>
                 <w:sz w:val="17"/>
               </w:rPr>
+              <w:t>鸡鹿共同吃草</w:t>
+            </w:r>
+          </w:p>
+        </w:tc>
+        <w:tc>
+          <w:tcPr>
+            <w:tcW w:type="dxa" w:w="3628"/>
+            <w:vAlign w:val="center"/>
+            <w:shd w:fill="F6F8FA"/>
+          </w:tcPr>
+          <w:p>
+            <w:r>
+              <w:rPr>
+                <w:rFonts w:ascii="宋体" w:hAnsi="宋体"/>
+                <w:sz w:val="17"/>
+              </w:rPr>
+              <w:t>鹿单只成本高、繁殖低，数量平台应低于鸡；两群资源不复制。</w:t>
+            </w:r>
+          </w:p>
+        </w:tc>
+        <w:tc>
+          <w:tcPr>
+            <w:tcW w:type="dxa" w:w="4252"/>
+            <w:vAlign w:val="center"/>
+            <w:shd w:fill="F6F8FA"/>
+          </w:tcPr>
+          <w:p>
+            <w:r>
+              <w:rPr>
+                <w:rFonts w:ascii="宋体" w:hAnsi="宋体"/>
+                <w:sz w:val="17"/>
+              </w:rPr>
+              <w:t>鸡 5,000、鹿 200、R=100,000，200 日后鸡 10,016、鹿 205；R=10,000 时鸡 455、鹿 80，库存约 61,601。</w:t>
+            </w:r>
+          </w:p>
+        </w:tc>
+      </w:tr>
+      <w:tr>
+        <w:tc>
+          <w:tcPr>
+            <w:tcW w:type="dxa" w:w="1757"/>
+            <w:vAlign w:val="center"/>
+          </w:tcPr>
+          <w:p>
+            <w:r>
+              <w:rPr>
+                <w:rFonts w:ascii="宋体" w:hAnsi="宋体"/>
+                <w:sz w:val="17"/>
+              </w:rPr>
               <w:t>断粮或极端超载</w:t>
             </w:r>
           </w:p>
@@ -19600,7 +19649,6 @@
           <w:tcPr>
             <w:tcW w:type="dxa" w:w="3628"/>
             <w:vAlign w:val="center"/>
-            <w:shd w:fill="F6F8FA"/>
           </w:tcPr>
           <w:p>
             <w:r>
@@ -19616,7 +19664,6 @@
           <w:tcPr>
             <w:tcW w:type="dxa" w:w="4252"/>
             <w:vAlign w:val="center"/>
-            <w:shd w:fill="F6F8FA"/>
           </w:tcPr>
           <w:p>
             <w:r>

</xml_diff>